<commit_message>
edit Rapport de validation
</commit_message>
<xml_diff>
--- a/Projet/Rapport_de_validation.docx
+++ b/Projet/Rapport_de_validation.docx
@@ -50,8 +50,8 @@
         <w:tblLook w:firstRow="1" w:noVBand="1" w:lastRow="0" w:firstColumn="1" w:lastColumn="0" w:noHBand="0" w:val="04a0"/>
       </w:tblPr>
       <w:tblGrid>
-        <w:gridCol w:w="2130"/>
-        <w:gridCol w:w="7590"/>
+        <w:gridCol w:w="2129"/>
+        <w:gridCol w:w="7591"/>
       </w:tblGrid>
       <w:tr>
         <w:trPr>
@@ -59,7 +59,7 @@
         </w:trPr>
         <w:tc>
           <w:tcPr>
-            <w:tcW w:w="2130" w:type="dxa"/>
+            <w:tcW w:w="2129" w:type="dxa"/>
             <w:tcBorders>
               <w:top w:val="single" w:sz="6" w:space="0" w:color="D9D9D9"/>
               <w:start w:val="single" w:sz="6" w:space="0" w:color="D9D9D9"/>
@@ -88,7 +88,7 @@
         </w:tc>
         <w:tc>
           <w:tcPr>
-            <w:tcW w:w="7590" w:type="dxa"/>
+            <w:tcW w:w="7591" w:type="dxa"/>
             <w:tcBorders>
               <w:top w:val="single" w:sz="6" w:space="0" w:color="D9D9D9"/>
               <w:start w:val="single" w:sz="6" w:space="0" w:color="D9D9D9"/>
@@ -121,7 +121,7 @@
         </w:trPr>
         <w:tc>
           <w:tcPr>
-            <w:tcW w:w="2130" w:type="dxa"/>
+            <w:tcW w:w="2129" w:type="dxa"/>
             <w:tcBorders>
               <w:top w:val="single" w:sz="6" w:space="0" w:color="D9D9D9"/>
               <w:start w:val="single" w:sz="6" w:space="0" w:color="D9D9D9"/>
@@ -150,7 +150,7 @@
         </w:tc>
         <w:tc>
           <w:tcPr>
-            <w:tcW w:w="7590" w:type="dxa"/>
+            <w:tcW w:w="7591" w:type="dxa"/>
             <w:tcBorders>
               <w:top w:val="single" w:sz="6" w:space="0" w:color="D9D9D9"/>
               <w:start w:val="single" w:sz="6" w:space="0" w:color="D9D9D9"/>
@@ -183,7 +183,7 @@
         </w:trPr>
         <w:tc>
           <w:tcPr>
-            <w:tcW w:w="2130" w:type="dxa"/>
+            <w:tcW w:w="2129" w:type="dxa"/>
             <w:tcBorders>
               <w:top w:val="single" w:sz="6" w:space="0" w:color="D9D9D9"/>
               <w:start w:val="single" w:sz="6" w:space="0" w:color="D9D9D9"/>
@@ -212,7 +212,7 @@
         </w:tc>
         <w:tc>
           <w:tcPr>
-            <w:tcW w:w="7590" w:type="dxa"/>
+            <w:tcW w:w="7591" w:type="dxa"/>
             <w:tcBorders>
               <w:top w:val="single" w:sz="6" w:space="0" w:color="D9D9D9"/>
               <w:start w:val="single" w:sz="6" w:space="0" w:color="D9D9D9"/>
@@ -239,68 +239,6 @@
           </w:p>
         </w:tc>
       </w:tr>
-      <w:tr>
-        <w:trPr>
-          <w:cantSplit w:val="true"/>
-        </w:trPr>
-        <w:tc>
-          <w:tcPr>
-            <w:tcW w:w="2130" w:type="dxa"/>
-            <w:tcBorders>
-              <w:top w:val="single" w:sz="6" w:space="0" w:color="D9D9D9"/>
-              <w:start w:val="single" w:sz="6" w:space="0" w:color="D9D9D9"/>
-              <w:bottom w:val="single" w:sz="6" w:space="0" w:color="D9D9D9"/>
-              <w:end w:val="single" w:sz="6" w:space="0" w:color="D9D9D9"/>
-            </w:tcBorders>
-            <w:shd w:fill="EAF1F8" w:val="clear"/>
-            <w:vAlign w:val="center"/>
-          </w:tcPr>
-          <w:p>
-            <w:pPr>
-              <w:pStyle w:val="Normal"/>
-              <w:spacing w:before="0" w:after="0"/>
-              <w:rPr/>
-            </w:pPr>
-            <w:r>
-              <w:rPr>
-                <w:rFonts w:eastAsia="Arial"/>
-                <w:b/>
-                <w:color w:val="000000"/>
-                <w:sz w:val="18"/>
-              </w:rPr>
-              <w:t>Projet matériel consulté</w:t>
-            </w:r>
-          </w:p>
-        </w:tc>
-        <w:tc>
-          <w:tcPr>
-            <w:tcW w:w="7590" w:type="dxa"/>
-            <w:tcBorders>
-              <w:top w:val="single" w:sz="6" w:space="0" w:color="D9D9D9"/>
-              <w:start w:val="single" w:sz="6" w:space="0" w:color="D9D9D9"/>
-              <w:bottom w:val="single" w:sz="6" w:space="0" w:color="D9D9D9"/>
-              <w:end w:val="single" w:sz="6" w:space="0" w:color="D9D9D9"/>
-            </w:tcBorders>
-            <w:vAlign w:val="center"/>
-          </w:tcPr>
-          <w:p>
-            <w:pPr>
-              <w:pStyle w:val="Normal"/>
-              <w:spacing w:before="0" w:after="0"/>
-              <w:rPr/>
-            </w:pPr>
-            <w:r>
-              <w:rPr>
-                <w:rFonts w:eastAsia="Arial"/>
-                <w:b w:val="false"/>
-                <w:color w:val="000000"/>
-                <w:sz w:val="18"/>
-              </w:rPr>
-              <w:t>Cora-Z7-10-Pmod-VGA-hw, génération Vivado 2020.2</w:t>
-            </w:r>
-          </w:p>
-        </w:tc>
-      </w:tr>
     </w:tbl>
     <w:p>
       <w:pPr>
@@ -325,7 +263,25 @@
           <w:color w:val="000000"/>
           <w:sz w:val="20"/>
         </w:rPr>
-        <w:t>Le DMA est partiellement validé par une simulation C réussie. La validation complète du système n’est pas acquise : les essais matériels de cadence, de mire, de sélection de source et d’affichage ne sont pas documentés, et la source VGA consultée est configurée en 1920 × 1080 au lieu des 640 × 480 demandés.</w:t>
+        <w:t xml:space="preserve">Le DMA est partiellement validé par une simulation C réussie. La validation complète du système n’est pas acquise : les essais matériels de cadence, d” </w:t>
+      </w:r>
+      <w:r>
+        <w:rPr>
+          <w:rFonts w:eastAsia="Arial"/>
+          <w:b w:val="false"/>
+          <w:color w:val="000000"/>
+          <w:sz w:val="20"/>
+        </w:rPr>
+        <w:t>flux d’images</w:t>
+      </w:r>
+      <w:r>
+        <w:rPr>
+          <w:rFonts w:eastAsia="Arial"/>
+          <w:b w:val="false"/>
+          <w:color w:val="000000"/>
+          <w:sz w:val="20"/>
+        </w:rPr>
+        <w:t>, de sélection de source et d’affichage ne sont pas documentés, et la source VGA consultée est configurée en 640 × 480 demandés.</w:t>
       </w:r>
     </w:p>
     <w:p>
@@ -353,9 +309,9 @@
         <w:tblLook w:firstRow="1" w:noVBand="1" w:lastRow="0" w:firstColumn="1" w:lastColumn="0" w:noHBand="0" w:val="04a0"/>
       </w:tblPr>
       <w:tblGrid>
-        <w:gridCol w:w="2231"/>
+        <w:gridCol w:w="2230"/>
         <w:gridCol w:w="1800"/>
-        <w:gridCol w:w="5689"/>
+        <w:gridCol w:w="5690"/>
       </w:tblGrid>
       <w:tr>
         <w:trPr>
@@ -364,7 +320,7 @@
         </w:trPr>
         <w:tc>
           <w:tcPr>
-            <w:tcW w:w="2231" w:type="dxa"/>
+            <w:tcW w:w="2230" w:type="dxa"/>
             <w:tcBorders>
               <w:top w:val="single" w:sz="6" w:space="0" w:color="D9D9D9"/>
               <w:start w:val="single" w:sz="6" w:space="0" w:color="D9D9D9"/>
@@ -422,7 +378,7 @@
         </w:tc>
         <w:tc>
           <w:tcPr>
-            <w:tcW w:w="5689" w:type="dxa"/>
+            <w:tcW w:w="5690" w:type="dxa"/>
             <w:tcBorders>
               <w:top w:val="single" w:sz="6" w:space="0" w:color="D9D9D9"/>
               <w:start w:val="single" w:sz="6" w:space="0" w:color="D9D9D9"/>
@@ -456,7 +412,7 @@
         </w:trPr>
         <w:tc>
           <w:tcPr>
-            <w:tcW w:w="2231" w:type="dxa"/>
+            <w:tcW w:w="2230" w:type="dxa"/>
             <w:tcBorders>
               <w:top w:val="single" w:sz="6" w:space="0" w:color="D9D9D9"/>
               <w:start w:val="single" w:sz="6" w:space="0" w:color="D9D9D9"/>
@@ -522,7 +478,7 @@
         </w:tc>
         <w:tc>
           <w:tcPr>
-            <w:tcW w:w="5689" w:type="dxa"/>
+            <w:tcW w:w="5690" w:type="dxa"/>
             <w:tcBorders>
               <w:top w:val="single" w:sz="6" w:space="0" w:color="D9D9D9"/>
               <w:start w:val="single" w:sz="6" w:space="0" w:color="D9D9D9"/>
@@ -548,16 +504,7 @@
                 <w:color w:val="000000"/>
                 <w:sz w:val="16"/>
               </w:rPr>
-              <w:t xml:space="preserve">C-simulation réussie sur image 640 × 480 RGB888; DDR réelle et cadence 60 images/s non vérifiées. </w:t>
-            </w:r>
-            <w:r>
-              <w:rPr>
-                <w:rFonts w:eastAsia="Arial"/>
-                <w:b w:val="false"/>
-                <w:color w:val="000000"/>
-                <w:sz w:val="16"/>
-              </w:rPr>
-              <w:t>Les résultats sont ceux fourni par les instructeurs lors de la transmission du dossier de base du DMA</w:t>
+              <w:t>C-simulation réussie sur image 640 × 480 RGB888; DDR réelle et cadence 60 images/s non vérifiées. Les résultats sont ceux fourni par les instructeurs lors de la transmission du dossier de base du DMA</w:t>
             </w:r>
           </w:p>
         </w:tc>
@@ -568,7 +515,7 @@
         </w:trPr>
         <w:tc>
           <w:tcPr>
-            <w:tcW w:w="2231" w:type="dxa"/>
+            <w:tcW w:w="2230" w:type="dxa"/>
             <w:tcBorders>
               <w:top w:val="single" w:sz="6" w:space="0" w:color="D9D9D9"/>
               <w:start w:val="single" w:sz="6" w:space="0" w:color="D9D9D9"/>
@@ -636,7 +583,7 @@
         </w:tc>
         <w:tc>
           <w:tcPr>
-            <w:tcW w:w="5689" w:type="dxa"/>
+            <w:tcW w:w="5690" w:type="dxa"/>
             <w:tcBorders>
               <w:top w:val="single" w:sz="6" w:space="0" w:color="D9D9D9"/>
               <w:start w:val="single" w:sz="6" w:space="0" w:color="D9D9D9"/>
@@ -663,7 +610,25 @@
                 <w:color w:val="000000"/>
                 <w:sz w:val="16"/>
               </w:rPr>
-              <w:t>Aucun résultat d’essai TPG n’est joint; le code VGA disponible dessine directement une mire mobile.</w:t>
+              <w:t xml:space="preserve">Aucun résultat d’essai TPG n’est joint; le code VGA disponible dessine directement un </w:t>
+            </w:r>
+            <w:r>
+              <w:rPr>
+                <w:rFonts w:eastAsia="Arial"/>
+                <w:b w:val="false"/>
+                <w:color w:val="000000"/>
+                <w:sz w:val="16"/>
+              </w:rPr>
+              <w:t>flux avec un élement</w:t>
+            </w:r>
+            <w:r>
+              <w:rPr>
+                <w:rFonts w:eastAsia="Arial"/>
+                <w:b w:val="false"/>
+                <w:color w:val="000000"/>
+                <w:sz w:val="16"/>
+              </w:rPr>
+              <w:t xml:space="preserve"> mobile.</w:t>
             </w:r>
           </w:p>
         </w:tc>
@@ -674,7 +639,7 @@
         </w:trPr>
         <w:tc>
           <w:tcPr>
-            <w:tcW w:w="2231" w:type="dxa"/>
+            <w:tcW w:w="2230" w:type="dxa"/>
             <w:tcBorders>
               <w:top w:val="single" w:sz="6" w:space="0" w:color="D9D9D9"/>
               <w:start w:val="single" w:sz="6" w:space="0" w:color="D9D9D9"/>
@@ -734,13 +699,13 @@
                 <w:color w:val="000000"/>
                 <w:sz w:val="16"/>
               </w:rPr>
-              <w:t>Écart de configuration</w:t>
+              <w:t>Partiel</w:t>
             </w:r>
           </w:p>
         </w:tc>
         <w:tc>
           <w:tcPr>
-            <w:tcW w:w="5689" w:type="dxa"/>
+            <w:tcW w:w="5690" w:type="dxa"/>
             <w:tcBorders>
               <w:top w:val="single" w:sz="6" w:space="0" w:color="D9D9D9"/>
               <w:start w:val="single" w:sz="6" w:space="0" w:color="D9D9D9"/>
@@ -766,61 +731,7 @@
                 <w:color w:val="000000"/>
                 <w:sz w:val="16"/>
               </w:rPr>
-              <w:t xml:space="preserve">Implémentation et bitstream générés; source configurée en </w:t>
-            </w:r>
-            <w:r>
-              <w:rPr>
-                <w:rFonts w:eastAsia="Arial"/>
-                <w:b w:val="false"/>
-                <w:color w:val="000000"/>
-                <w:sz w:val="16"/>
-              </w:rPr>
-              <w:t>640*480</w:t>
-            </w:r>
-            <w:r>
-              <w:rPr>
-                <w:rFonts w:eastAsia="Arial"/>
-                <w:b w:val="false"/>
-                <w:color w:val="000000"/>
-                <w:sz w:val="16"/>
-              </w:rPr>
-              <w:t xml:space="preserve">, et affichage physique </w:t>
-            </w:r>
-            <w:r>
-              <w:rPr>
-                <w:rFonts w:eastAsia="Arial"/>
-                <w:b w:val="false"/>
-                <w:color w:val="000000"/>
-                <w:sz w:val="16"/>
-              </w:rPr>
-              <w:t>c</w:t>
-            </w:r>
-            <w:r>
-              <w:rPr>
-                <w:rFonts w:eastAsia="Arial"/>
-                <w:b w:val="false"/>
-                <w:color w:val="000000"/>
-                <w:sz w:val="16"/>
-              </w:rPr>
-              <w:t xml:space="preserve">onsigné </w:t>
-            </w:r>
-            <w:r>
-              <w:rPr>
-                <w:rFonts w:eastAsia="Arial"/>
-                <w:b w:val="false"/>
-                <w:color w:val="000000"/>
-                <w:sz w:val="16"/>
-              </w:rPr>
-              <w:t>(vidéo)</w:t>
-            </w:r>
-            <w:r>
-              <w:rPr>
-                <w:rFonts w:eastAsia="Arial"/>
-                <w:b w:val="false"/>
-                <w:color w:val="000000"/>
-                <w:sz w:val="16"/>
-              </w:rPr>
-              <w:t>.</w:t>
+              <w:t>Implémentation et bitstream générés; source configurée en 640*480, et affichage physique consigné (vidéo).</w:t>
             </w:r>
           </w:p>
         </w:tc>
@@ -831,7 +742,7 @@
         </w:trPr>
         <w:tc>
           <w:tcPr>
-            <w:tcW w:w="2231" w:type="dxa"/>
+            <w:tcW w:w="2230" w:type="dxa"/>
             <w:tcBorders>
               <w:top w:val="single" w:sz="6" w:space="0" w:color="D9D9D9"/>
               <w:start w:val="single" w:sz="6" w:space="0" w:color="D9D9D9"/>
@@ -860,7 +771,7 @@
               </w:rPr>
               <w:t>Sélection de source</w:t>
               <w:br/>
-              <w:t>PL-IP-002 / PL-IP-003</w:t>
+              <w:t xml:space="preserve">PL-IP-002 </w:t>
             </w:r>
           </w:p>
         </w:tc>
@@ -899,7 +810,7 @@
         </w:tc>
         <w:tc>
           <w:tcPr>
-            <w:tcW w:w="5689" w:type="dxa"/>
+            <w:tcW w:w="5690" w:type="dxa"/>
             <w:tcBorders>
               <w:top w:val="single" w:sz="6" w:space="0" w:color="D9D9D9"/>
               <w:start w:val="single" w:sz="6" w:space="0" w:color="D9D9D9"/>
@@ -926,7 +837,7 @@
                 <w:color w:val="000000"/>
                 <w:sz w:val="16"/>
               </w:rPr>
-              <w:t>Aucune preuve de sélection initiale par le PS ou de bascule à chaud par registre.</w:t>
+              <w:t>Aucune preuve de sélection initiale par le PS.</w:t>
             </w:r>
           </w:p>
         </w:tc>
@@ -981,7 +892,7 @@
           <w:color w:val="000000"/>
           <w:sz w:val="20"/>
         </w:rPr>
-        <w:t>Référence fonctionnelle : SRS SoC Tracking, révision AB du 31 août 2026. Les exigences du périmètre sont PL-IP-000 (DMA), PL-IP-001 (TPG), PL-IP-002 (sélection à l’initialisation), PL-IP-003 (sélection à chaud) et PL-DISP-002 (affichage VGA).</w:t>
+        <w:t>Référence fonctionnelle : SRS SoC Tracking, révision AB du 31 août 2026. Les exigences du périmètre sont PL-IP-000 (DMA), PL-IP-001 (TPG), PL-IP-002 (sélection à l’initialisation) et PL-DISP-002 (affichage VGA).</w:t>
       </w:r>
     </w:p>
     <w:p>
@@ -1013,26 +924,405 @@
           <w:color w:val="000000"/>
           <w:sz w:val="20"/>
         </w:rPr>
-        <w:t>Le PMOD_VGA ainsi que le TPG on était vérifié sur carte une vidéo est disponible à cette effet</w:t>
+        <w:t>Le PMOD_VGA ainsi que le TPG on était vérifié sur carte une vidéo est disponible à cette effet.</w:t>
+      </w:r>
+    </w:p>
+    <w:p>
+      <w:pPr>
+        <w:pStyle w:val="Heading1"/>
+        <w:rPr/>
+      </w:pPr>
+      <w:r>
+        <w:rPr/>
+      </w:r>
+      <w:r>
+        <w:br w:type="page"/>
+      </w:r>
+    </w:p>
+    <w:p>
+      <w:pPr>
+        <w:pStyle w:val="Heading1"/>
+        <w:rPr/>
+      </w:pPr>
+      <w:r>
+        <w:rPr/>
+        <w:t>3. Résultats détaillés</w:t>
+      </w:r>
+    </w:p>
+    <w:p>
+      <w:pPr>
+        <w:pStyle w:val="Heading2"/>
+        <w:rPr/>
+      </w:pPr>
+      <w:r>
+        <w:rPr/>
+        <w:t>3.3 Affichage PMOD VGA - écart de configuration</w:t>
+      </w:r>
+    </w:p>
+    <w:p>
+      <w:pPr>
+        <w:pStyle w:val="Normal"/>
+        <w:rPr/>
+      </w:pPr>
+      <w:r>
+        <w:rPr/>
+        <w:drawing>
+          <wp:anchor distT="0" distB="0" distL="0" distR="0" simplePos="0" relativeHeight="2" behindDoc="0" locked="0" layoutInCell="0" allowOverlap="1">
+            <wp:simplePos x="0" y="0"/>
+            <wp:positionH relativeFrom="column">
+              <wp:align>center</wp:align>
+            </wp:positionH>
+            <wp:positionV relativeFrom="paragraph">
+              <wp:posOffset>635</wp:posOffset>
+            </wp:positionV>
+            <wp:extent cx="2143125" cy="1704975"/>
+            <wp:effectExtent l="0" t="0" r="0" b="0"/>
+            <wp:wrapTopAndBottom/>
+            <wp:docPr id="1" name="Image1"/>
+            <wp:cNvGraphicFramePr>
+              <a:graphicFrameLocks xmlns:a="http://schemas.openxmlformats.org/drawingml/2006/main" noChangeAspect="1"/>
+            </wp:cNvGraphicFramePr>
+            <a:graphic xmlns:a="http://schemas.openxmlformats.org/drawingml/2006/main">
+              <a:graphicData uri="http://schemas.openxmlformats.org/drawingml/2006/picture">
+                <pic:pic xmlns:pic="http://schemas.openxmlformats.org/drawingml/2006/picture">
+                  <pic:nvPicPr>
+                    <pic:cNvPr id="1" name="Image1"/>
+                    <pic:cNvPicPr>
+                      <a:picLocks noChangeAspect="1" noChangeArrowheads="1"/>
+                    </pic:cNvPicPr>
+                  </pic:nvPicPr>
+                  <pic:blipFill>
+                    <a:blip r:embed="rId2"/>
+                    <a:stretch>
+                      <a:fillRect/>
+                    </a:stretch>
+                  </pic:blipFill>
+                  <pic:spPr bwMode="auto">
+                    <a:xfrm>
+                      <a:off x="0" y="0"/>
+                      <a:ext cx="2143125" cy="1704975"/>
+                    </a:xfrm>
+                    <a:prstGeom prst="rect">
+                      <a:avLst/>
+                    </a:prstGeom>
+                    <a:noFill/>
+                  </pic:spPr>
+                </pic:pic>
+              </a:graphicData>
+            </a:graphic>
+          </wp:anchor>
+        </w:drawing>
+      </w:r>
+    </w:p>
+    <w:p>
+      <w:pPr>
+        <w:pStyle w:val="Normal"/>
+        <w:spacing w:before="0" w:after="80"/>
+        <w:ind w:hanging="173" w:start="173"/>
+        <w:rPr/>
+      </w:pPr>
+      <w:r>
+        <w:rPr>
+          <w:rFonts w:eastAsia="Arial"/>
+          <w:b/>
+          <w:color w:val="000000"/>
+          <w:sz w:val="19"/>
+        </w:rPr>
+        <w:t xml:space="preserve">Exigence : </w:t>
       </w:r>
       <w:r>
         <w:rPr>
           <w:rFonts w:eastAsia="Arial"/>
           <w:b w:val="false"/>
           <w:color w:val="000000"/>
-          <w:sz w:val="20"/>
+          <w:sz w:val="19"/>
         </w:rPr>
-        <w:t>.</w:t>
+        <w:t>PL-DISP-002 demande l’affichage d’un flux vidéo compatible VGA en 640 × 480 à 60 Hz.</w:t>
       </w:r>
     </w:p>
     <w:p>
       <w:pPr>
-        <w:pStyle w:val="Heading1"/>
+        <w:pStyle w:val="Normal"/>
+        <w:spacing w:before="0" w:after="80"/>
+        <w:ind w:hanging="173" w:start="173"/>
+        <w:rPr/>
+      </w:pPr>
+      <w:r>
+        <w:rPr>
+          <w:rFonts w:eastAsia="Arial"/>
+          <w:b/>
+          <w:color w:val="000000"/>
+          <w:sz w:val="19"/>
+        </w:rPr>
+        <w:t xml:space="preserve">Observation de configuration : </w:t>
+      </w:r>
+      <w:r>
+        <w:rPr>
+          <w:rFonts w:eastAsia="Arial"/>
+          <w:b w:val="false"/>
+          <w:color w:val="000000"/>
+          <w:sz w:val="19"/>
+        </w:rPr>
+        <w:t xml:space="preserve">Dans </w:t>
+      </w:r>
+      <w:r>
+        <w:rPr>
+          <w:rFonts w:eastAsia="Arial"/>
+          <w:b w:val="false"/>
+          <w:color w:val="000000"/>
+          <w:sz w:val="19"/>
+        </w:rPr>
+        <w:t>PMODVGA_V1_0</w:t>
+      </w:r>
+      <w:r>
+        <w:rPr>
+          <w:rFonts w:eastAsia="Arial"/>
+          <w:b w:val="false"/>
+          <w:color w:val="000000"/>
+          <w:sz w:val="19"/>
+        </w:rPr>
+        <w:t>.vhd, FRAME_WIDTH vaut 640 et FRAME_HEIGHT vaut 480. Cette configuration correspond au mode demandé par le SRS. Le fichier Cora-Z7-10-Master.xdc associe bien les sorties VGA aux broches des connecteurs PMOD.</w:t>
+      </w:r>
+    </w:p>
+    <w:p>
+      <w:pPr>
+        <w:pStyle w:val="Normal"/>
+        <w:spacing w:before="0" w:after="80"/>
+        <w:ind w:hanging="173" w:start="173"/>
+        <w:rPr/>
+      </w:pPr>
+      <w:r>
+        <w:rPr>
+          <w:rFonts w:eastAsia="Arial"/>
+          <w:b/>
+          <w:color w:val="000000"/>
+          <w:sz w:val="19"/>
+        </w:rPr>
+        <w:t xml:space="preserve">Preuve d’implémentation : </w:t>
+      </w:r>
+      <w:r>
+        <w:rPr>
+          <w:rFonts w:eastAsia="Arial"/>
+          <w:b w:val="false"/>
+          <w:color w:val="000000"/>
+          <w:sz w:val="19"/>
+        </w:rPr>
+        <w:t>Les journaux Vivado indiquent une synthèse et une implémentation achevées, un routage réussi et la création de top.bit. Une implémentation réaliser uniquement avec le bloc TPG. Résultat sous forme de vidéo.</w:t>
+      </w:r>
+    </w:p>
+    <w:p>
+      <w:pPr>
+        <w:pStyle w:val="Normal"/>
+        <w:spacing w:before="0" w:after="80"/>
+        <w:ind w:hanging="173" w:start="173"/>
+        <w:rPr/>
+      </w:pPr>
+      <w:r>
+        <w:rPr>
+          <w:rFonts w:eastAsia="Arial"/>
+          <w:b/>
+          <w:color w:val="000000"/>
+          <w:sz w:val="19"/>
+        </w:rPr>
+        <w:t xml:space="preserve">Limite et verdict : </w:t>
+      </w:r>
+      <w:r>
+        <w:rPr>
+          <w:rFonts w:eastAsia="Arial"/>
+          <w:b w:val="false"/>
+          <w:bCs w:val="false"/>
+          <w:color w:val="000000"/>
+          <w:sz w:val="19"/>
+        </w:rPr>
+        <w:t>L’implémentation ainsi que la preuve matériel on été réaliser.</w:t>
+      </w:r>
+      <w:r>
+        <w:rPr>
+          <w:rFonts w:eastAsia="Arial"/>
+          <w:b w:val="false"/>
+          <w:color w:val="000000"/>
+          <w:sz w:val="19"/>
+        </w:rPr>
+        <w:t xml:space="preserve"> Verdict : partiellement validé; Preuve matériel fourni.</w:t>
+      </w:r>
+    </w:p>
+    <w:p>
+      <w:pPr>
+        <w:pStyle w:val="Heading2"/>
         <w:rPr/>
       </w:pPr>
       <w:r>
         <w:rPr/>
-        <w:t>3. Résultats détaillés</w:t>
+        <w:t>3.2 TPG – vérifié uniquement en preuve materiel</w:t>
+      </w:r>
+    </w:p>
+    <w:p>
+      <w:pPr>
+        <w:pStyle w:val="Normal"/>
+        <w:rPr/>
+      </w:pPr>
+      <w:r>
+        <w:rPr/>
+        <w:drawing>
+          <wp:anchor distT="0" distB="0" distL="0" distR="0" simplePos="0" relativeHeight="3" behindDoc="0" locked="0" layoutInCell="0" allowOverlap="1">
+            <wp:simplePos x="0" y="0"/>
+            <wp:positionH relativeFrom="column">
+              <wp:align>center</wp:align>
+            </wp:positionH>
+            <wp:positionV relativeFrom="paragraph">
+              <wp:posOffset>635</wp:posOffset>
+            </wp:positionV>
+            <wp:extent cx="2371725" cy="1304925"/>
+            <wp:effectExtent l="0" t="0" r="0" b="0"/>
+            <wp:wrapTopAndBottom/>
+            <wp:docPr id="2" name="Image2"/>
+            <wp:cNvGraphicFramePr>
+              <a:graphicFrameLocks xmlns:a="http://schemas.openxmlformats.org/drawingml/2006/main" noChangeAspect="1"/>
+            </wp:cNvGraphicFramePr>
+            <a:graphic xmlns:a="http://schemas.openxmlformats.org/drawingml/2006/main">
+              <a:graphicData uri="http://schemas.openxmlformats.org/drawingml/2006/picture">
+                <pic:pic xmlns:pic="http://schemas.openxmlformats.org/drawingml/2006/picture">
+                  <pic:nvPicPr>
+                    <pic:cNvPr id="2" name="Image2"/>
+                    <pic:cNvPicPr>
+                      <a:picLocks noChangeAspect="1" noChangeArrowheads="1"/>
+                    </pic:cNvPicPr>
+                  </pic:nvPicPr>
+                  <pic:blipFill>
+                    <a:blip r:embed="rId3"/>
+                    <a:stretch>
+                      <a:fillRect/>
+                    </a:stretch>
+                  </pic:blipFill>
+                  <pic:spPr bwMode="auto">
+                    <a:xfrm>
+                      <a:off x="0" y="0"/>
+                      <a:ext cx="2371725" cy="1304925"/>
+                    </a:xfrm>
+                    <a:prstGeom prst="rect">
+                      <a:avLst/>
+                    </a:prstGeom>
+                    <a:noFill/>
+                  </pic:spPr>
+                </pic:pic>
+              </a:graphicData>
+            </a:graphic>
+          </wp:anchor>
+        </w:drawing>
+      </w:r>
+    </w:p>
+    <w:p>
+      <w:pPr>
+        <w:pStyle w:val="Normal"/>
+        <w:spacing w:before="0" w:after="80"/>
+        <w:ind w:hanging="173" w:start="173"/>
+        <w:rPr/>
+      </w:pPr>
+      <w:r>
+        <w:rPr>
+          <w:rFonts w:eastAsia="Arial"/>
+          <w:b/>
+          <w:color w:val="000000"/>
+          <w:sz w:val="19"/>
+        </w:rPr>
+        <w:t xml:space="preserve">Exigence : </w:t>
+      </w:r>
+      <w:r>
+        <w:rPr>
+          <w:rFonts w:eastAsia="Arial"/>
+          <w:b w:val="false"/>
+          <w:color w:val="000000"/>
+          <w:sz w:val="19"/>
+        </w:rPr>
+        <w:t xml:space="preserve">PL-IP-001 requiert une </w:t>
+      </w:r>
+      <w:r>
+        <w:rPr>
+          <w:rFonts w:eastAsia="Arial"/>
+          <w:b w:val="false"/>
+          <w:color w:val="000000"/>
+          <w:sz w:val="19"/>
+        </w:rPr>
+        <w:t>image</w:t>
+      </w:r>
+      <w:r>
+        <w:rPr>
+          <w:rFonts w:eastAsia="Arial"/>
+          <w:b w:val="false"/>
+          <w:color w:val="000000"/>
+          <w:sz w:val="19"/>
+        </w:rPr>
+        <w:t xml:space="preserve"> comportant au moins un élément dynamique.</w:t>
+      </w:r>
+    </w:p>
+    <w:p>
+      <w:pPr>
+        <w:pStyle w:val="Normal"/>
+        <w:spacing w:before="0" w:after="80"/>
+        <w:ind w:hanging="173" w:start="173"/>
+        <w:rPr/>
+      </w:pPr>
+      <w:r>
+        <w:rPr>
+          <w:rFonts w:eastAsia="Arial"/>
+          <w:b/>
+          <w:color w:val="000000"/>
+          <w:sz w:val="19"/>
+        </w:rPr>
+        <w:t xml:space="preserve">Observation : </w:t>
+      </w:r>
+      <w:r>
+        <w:rPr>
+          <w:rFonts w:eastAsia="Arial"/>
+          <w:b w:val="false"/>
+          <w:color w:val="000000"/>
+          <w:sz w:val="19"/>
+        </w:rPr>
+        <w:t xml:space="preserve">Le </w:t>
+      </w:r>
+      <w:r>
+        <w:rPr>
+          <w:rFonts w:eastAsia="Arial"/>
+          <w:b w:val="false"/>
+          <w:color w:val="000000"/>
+          <w:sz w:val="19"/>
+        </w:rPr>
+        <w:t>TGP_v1_0</w:t>
+      </w:r>
+      <w:r>
+        <w:rPr>
+          <w:rFonts w:eastAsia="Arial"/>
+          <w:b w:val="false"/>
+          <w:color w:val="000000"/>
+          <w:sz w:val="19"/>
+        </w:rPr>
+        <w:t>.vhd disponible contient une logique de mire VGA qui anime un rectangle directement à partir des compteurs de position. Les fichiers Axi4s_driver.vhd et Axi4s_monitor.vhd sont des utilitaires de génération et de capture AXI4-Stream; ils ne constituent pas à eux seuls une preuve d’exécution du TPG.</w:t>
+      </w:r>
+    </w:p>
+    <w:p>
+      <w:pPr>
+        <w:pStyle w:val="Normal"/>
+        <w:spacing w:before="0" w:after="80"/>
+        <w:ind w:hanging="173" w:start="173"/>
+        <w:rPr/>
+      </w:pPr>
+      <w:r>
+        <w:rPr>
+          <w:rFonts w:eastAsia="Arial"/>
+          <w:b/>
+          <w:color w:val="000000"/>
+          <w:sz w:val="19"/>
+        </w:rPr>
+        <w:t xml:space="preserve">Limite et verdict : </w:t>
+      </w:r>
+      <w:r>
+        <w:rPr>
+          <w:rFonts w:eastAsia="Arial"/>
+          <w:b w:val="false"/>
+          <w:color w:val="000000"/>
+          <w:sz w:val="19"/>
+        </w:rPr>
+        <w:t>Aucun résultat de simulation ou de capture sur FPGA confirmant le mouvement de la mire n’est fourni. Le raccordement d’un TPG AXI4-Stream indépendant au chemin de sélection n’est pas établi par les éléments consultés. Verdict : vérifié uniquement sur matériel; exécuter VP-TPG-01.</w:t>
       </w:r>
     </w:p>
     <w:p>
@@ -1182,331 +1472,6 @@
       </w:pPr>
       <w:r>
         <w:rPr/>
-        <w:t xml:space="preserve">3.2 TPG – vérifié </w:t>
-      </w:r>
-      <w:r>
-        <w:rPr/>
-        <w:t>uniquement en preuve materiel</w:t>
-      </w:r>
-    </w:p>
-    <w:p>
-      <w:pPr>
-        <w:pStyle w:val="Normal"/>
-        <w:spacing w:before="0" w:after="80"/>
-        <w:ind w:hanging="173" w:start="173"/>
-        <w:rPr/>
-      </w:pPr>
-      <w:r>
-        <w:rPr>
-          <w:rFonts w:eastAsia="Arial"/>
-          <w:b/>
-          <w:color w:val="000000"/>
-          <w:sz w:val="19"/>
-        </w:rPr>
-        <w:t xml:space="preserve">Exigence : </w:t>
-      </w:r>
-      <w:r>
-        <w:rPr>
-          <w:rFonts w:eastAsia="Arial"/>
-          <w:b w:val="false"/>
-          <w:color w:val="000000"/>
-          <w:sz w:val="19"/>
-        </w:rPr>
-        <w:t>PL-IP-001 requiert une mire comportant au moins un élément dynamique.</w:t>
-      </w:r>
-    </w:p>
-    <w:p>
-      <w:pPr>
-        <w:pStyle w:val="Normal"/>
-        <w:spacing w:before="0" w:after="80"/>
-        <w:ind w:hanging="173" w:start="173"/>
-        <w:rPr/>
-      </w:pPr>
-      <w:r>
-        <w:rPr>
-          <w:rFonts w:eastAsia="Arial"/>
-          <w:b/>
-          <w:color w:val="000000"/>
-          <w:sz w:val="19"/>
-        </w:rPr>
-        <w:t xml:space="preserve">Observation : </w:t>
-      </w:r>
-      <w:r>
-        <w:rPr>
-          <w:rFonts w:eastAsia="Arial"/>
-          <w:b w:val="false"/>
-          <w:color w:val="000000"/>
-          <w:sz w:val="19"/>
-        </w:rPr>
-        <w:t>Le top.vhd disponible contient une logique de mire VGA qui anime un rectangle directement à partir des compteurs de position. Les fichiers Axi4s_driver.vhd et Axi4s_monitor.vhd sont des utilitaires de génération et de capture AXI4-Stream; ils ne constituent pas à eux seuls une preuve d’exécution du TPG.</w:t>
-      </w:r>
-    </w:p>
-    <w:p>
-      <w:pPr>
-        <w:pStyle w:val="Normal"/>
-        <w:spacing w:before="0" w:after="80"/>
-        <w:ind w:hanging="173" w:start="173"/>
-        <w:rPr/>
-      </w:pPr>
-      <w:r>
-        <w:rPr>
-          <w:rFonts w:eastAsia="Arial"/>
-          <w:b/>
-          <w:color w:val="000000"/>
-          <w:sz w:val="19"/>
-        </w:rPr>
-        <w:t xml:space="preserve">Limite et verdict : </w:t>
-      </w:r>
-      <w:r>
-        <w:rPr>
-          <w:rFonts w:eastAsia="Arial"/>
-          <w:b w:val="false"/>
-          <w:color w:val="000000"/>
-          <w:sz w:val="19"/>
-        </w:rPr>
-        <w:t>Aucun résultat de simulation ou de capture sur FPGA confirmant le mouvement de la mire n’est fourni. Le raccordement d’un TPG AXI4-Stream indépendant au chemin de sélection n’est pas établi par les éléments consultés. Verdict : vérifié</w:t>
-      </w:r>
-      <w:r>
-        <w:rPr>
-          <w:rFonts w:eastAsia="Arial"/>
-          <w:b w:val="false"/>
-          <w:color w:val="000000"/>
-          <w:sz w:val="19"/>
-        </w:rPr>
-        <w:t xml:space="preserve"> uniquement sur matériel</w:t>
-      </w:r>
-      <w:r>
-        <w:rPr>
-          <w:rFonts w:eastAsia="Arial"/>
-          <w:b w:val="false"/>
-          <w:color w:val="000000"/>
-          <w:sz w:val="19"/>
-        </w:rPr>
-        <w:t>; exécuter VP-TPG-01.</w:t>
-      </w:r>
-    </w:p>
-    <w:p>
-      <w:pPr>
-        <w:pStyle w:val="Heading2"/>
-        <w:rPr/>
-      </w:pPr>
-      <w:r>
-        <w:rPr/>
-        <w:t>3.3 Affichage PMOD VGA - écart de configuration</w:t>
-      </w:r>
-    </w:p>
-    <w:p>
-      <w:pPr>
-        <w:pStyle w:val="Normal"/>
-        <w:spacing w:before="0" w:after="80"/>
-        <w:ind w:hanging="173" w:start="173"/>
-        <w:rPr/>
-      </w:pPr>
-      <w:r>
-        <w:rPr>
-          <w:rFonts w:eastAsia="Arial"/>
-          <w:b/>
-          <w:color w:val="000000"/>
-          <w:sz w:val="19"/>
-        </w:rPr>
-        <w:t xml:space="preserve">Exigence : </w:t>
-      </w:r>
-      <w:r>
-        <w:rPr>
-          <w:rFonts w:eastAsia="Arial"/>
-          <w:b w:val="false"/>
-          <w:color w:val="000000"/>
-          <w:sz w:val="19"/>
-        </w:rPr>
-        <w:t>PL-DISP-002 demande l’affichage d’un flux vidéo compatible VGA en 640 × 480 à 60 Hz.</w:t>
-      </w:r>
-    </w:p>
-    <w:p>
-      <w:pPr>
-        <w:pStyle w:val="Normal"/>
-        <w:spacing w:before="0" w:after="80"/>
-        <w:ind w:hanging="173" w:start="173"/>
-        <w:rPr/>
-      </w:pPr>
-      <w:r>
-        <w:rPr>
-          <w:rFonts w:eastAsia="Arial"/>
-          <w:b/>
-          <w:color w:val="000000"/>
-          <w:sz w:val="19"/>
-        </w:rPr>
-        <w:t xml:space="preserve">Observation de configuration : </w:t>
-      </w:r>
-      <w:r>
-        <w:rPr>
-          <w:rFonts w:eastAsia="Arial"/>
-          <w:b w:val="false"/>
-          <w:color w:val="000000"/>
-          <w:sz w:val="19"/>
-        </w:rPr>
-        <w:t xml:space="preserve">Dans top.vhd, FRAME_WIDTH vaut </w:t>
-      </w:r>
-      <w:r>
-        <w:rPr>
-          <w:rFonts w:eastAsia="Arial"/>
-          <w:b w:val="false"/>
-          <w:color w:val="000000"/>
-          <w:sz w:val="19"/>
-        </w:rPr>
-        <w:t>640</w:t>
-      </w:r>
-      <w:r>
-        <w:rPr>
-          <w:rFonts w:eastAsia="Arial"/>
-          <w:b w:val="false"/>
-          <w:color w:val="000000"/>
-          <w:sz w:val="19"/>
-        </w:rPr>
-        <w:t xml:space="preserve"> et FRAME_HEIGHT vaut </w:t>
-      </w:r>
-      <w:r>
-        <w:rPr>
-          <w:rFonts w:eastAsia="Arial"/>
-          <w:b w:val="false"/>
-          <w:color w:val="000000"/>
-          <w:sz w:val="19"/>
-        </w:rPr>
-        <w:t>480</w:t>
-      </w:r>
-      <w:r>
-        <w:rPr>
-          <w:rFonts w:eastAsia="Arial"/>
-          <w:b w:val="false"/>
-          <w:color w:val="000000"/>
-          <w:sz w:val="19"/>
-        </w:rPr>
-        <w:t>. Cette configuration correspond au mode demandé par le SRS. Le fichier Cora-Z7-10-Master.xdc associe bien les sorties VGA aux broches des connecteurs PMOD.</w:t>
-      </w:r>
-    </w:p>
-    <w:p>
-      <w:pPr>
-        <w:pStyle w:val="Normal"/>
-        <w:spacing w:before="0" w:after="80"/>
-        <w:ind w:hanging="173" w:start="173"/>
-        <w:rPr/>
-      </w:pPr>
-      <w:r>
-        <w:rPr>
-          <w:rFonts w:eastAsia="Arial"/>
-          <w:b/>
-          <w:color w:val="000000"/>
-          <w:sz w:val="19"/>
-        </w:rPr>
-        <w:t xml:space="preserve">Preuve d’implémentation : </w:t>
-      </w:r>
-      <w:r>
-        <w:rPr>
-          <w:rFonts w:eastAsia="Arial"/>
-          <w:b w:val="false"/>
-          <w:color w:val="000000"/>
-          <w:sz w:val="19"/>
-        </w:rPr>
-        <w:t xml:space="preserve">Les journaux Vivado indiquent une synthèse et une implémentation achevées, un routage réussi et la création de top.bit. </w:t>
-      </w:r>
-      <w:r>
-        <w:rPr>
-          <w:rFonts w:eastAsia="Arial"/>
-          <w:b w:val="false"/>
-          <w:color w:val="000000"/>
-          <w:sz w:val="19"/>
-        </w:rPr>
-        <w:t>Une implémentation réaliser uniquement avec le bloc TPG. Résultat sous forme de vidéo.</w:t>
-      </w:r>
-    </w:p>
-    <w:p>
-      <w:pPr>
-        <w:pStyle w:val="Normal"/>
-        <w:spacing w:before="0" w:after="80"/>
-        <w:ind w:hanging="173" w:start="173"/>
-        <w:rPr/>
-      </w:pPr>
-      <w:r>
-        <w:rPr>
-          <w:rFonts w:eastAsia="Arial"/>
-          <w:b/>
-          <w:color w:val="000000"/>
-          <w:sz w:val="19"/>
-        </w:rPr>
-        <w:t xml:space="preserve">Limite et verdict : </w:t>
-      </w:r>
-      <w:r>
-        <w:rPr>
-          <w:rFonts w:eastAsia="Arial"/>
-          <w:b w:val="false"/>
-          <w:bCs w:val="false"/>
-          <w:color w:val="000000"/>
-          <w:sz w:val="19"/>
-        </w:rPr>
-        <w:t>L’implémentation ainsi que la preuve matériel on été réaliser</w:t>
-      </w:r>
-      <w:r>
-        <w:rPr>
-          <w:rFonts w:eastAsia="Arial"/>
-          <w:b w:val="false"/>
-          <w:bCs w:val="false"/>
-          <w:color w:val="000000"/>
-          <w:sz w:val="19"/>
-        </w:rPr>
-        <w:t>.</w:t>
-      </w:r>
-      <w:r>
-        <w:rPr>
-          <w:rFonts w:eastAsia="Arial"/>
-          <w:b w:val="false"/>
-          <w:color w:val="000000"/>
-          <w:sz w:val="19"/>
-        </w:rPr>
-        <w:t xml:space="preserve"> Verdict : </w:t>
-      </w:r>
-      <w:r>
-        <w:rPr>
-          <w:rFonts w:eastAsia="Arial"/>
-          <w:b w:val="false"/>
-          <w:color w:val="000000"/>
-          <w:sz w:val="19"/>
-        </w:rPr>
-        <w:t>partiellement</w:t>
-      </w:r>
-      <w:r>
-        <w:rPr>
-          <w:rFonts w:eastAsia="Arial"/>
-          <w:b w:val="false"/>
-          <w:color w:val="000000"/>
-          <w:sz w:val="19"/>
-        </w:rPr>
-        <w:t xml:space="preserve"> validé; </w:t>
-      </w:r>
-      <w:r>
-        <w:rPr>
-          <w:rFonts w:eastAsia="Arial"/>
-          <w:b w:val="false"/>
-          <w:color w:val="000000"/>
-          <w:sz w:val="19"/>
-        </w:rPr>
-        <w:t>Preuve matériel fourni</w:t>
-      </w:r>
-      <w:r>
-        <w:rPr>
-          <w:rFonts w:eastAsia="Arial"/>
-          <w:b w:val="false"/>
-          <w:color w:val="000000"/>
-          <w:sz w:val="19"/>
-        </w:rPr>
-        <w:t>.</w:t>
-      </w:r>
-    </w:p>
-    <w:p>
-      <w:pPr>
-        <w:pStyle w:val="Heading2"/>
-        <w:rPr/>
-      </w:pPr>
-      <w:r>
-        <w:rPr/>
         <w:t>3.4 Sélection de source - non vérifiée</w:t>
       </w:r>
     </w:p>
@@ -1611,43 +1576,7 @@
           <w:color w:val="000000"/>
           <w:sz w:val="20"/>
         </w:rPr>
-        <w:t xml:space="preserve">Le résultat DMA est positif pour la simulation C fonctionnelle, mais le dossier ne démontre pas encore le fonctionnement complet sur FPGA. Le mode VGA </w:t>
-      </w:r>
-      <w:r>
-        <w:rPr>
-          <w:rFonts w:eastAsia="Arial"/>
-          <w:b w:val="false"/>
-          <w:color w:val="000000"/>
-          <w:sz w:val="20"/>
-        </w:rPr>
-        <w:t xml:space="preserve">est </w:t>
-      </w:r>
-      <w:r>
-        <w:rPr>
-          <w:rFonts w:eastAsia="Arial"/>
-          <w:b w:val="false"/>
-          <w:color w:val="000000"/>
-          <w:sz w:val="20"/>
-        </w:rPr>
-        <w:t xml:space="preserve">configuré; la sélection des sources </w:t>
-      </w:r>
-      <w:r>
-        <w:rPr>
-          <w:rFonts w:eastAsia="Arial"/>
-          <w:b w:val="false"/>
-          <w:color w:val="000000"/>
-          <w:sz w:val="20"/>
-        </w:rPr>
-        <w:t>et</w:t>
-      </w:r>
-      <w:r>
-        <w:rPr>
-          <w:rFonts w:eastAsia="Arial"/>
-          <w:b w:val="false"/>
-          <w:color w:val="000000"/>
-          <w:sz w:val="20"/>
-        </w:rPr>
-        <w:t xml:space="preserve"> la lecture DDR réelle restent à établir.</w:t>
+        <w:t>Le résultat DMA est positif pour la simulation C fonctionnelle, mais le dossier ne démontre pas encore le fonctionnement complet sur FPGA. Le mode VGA est configuré; la sélection des sources et la lecture DDR réelle restent à établir.</w:t>
       </w:r>
     </w:p>
     <w:tbl>
@@ -1796,16 +1725,7 @@
                 <w:color w:val="000000"/>
                 <w:sz w:val="17"/>
               </w:rPr>
-              <w:t>Vérifier fonctionnement avec DMA et selection de source</w:t>
-            </w:r>
-            <w:r>
-              <w:rPr>
-                <w:rFonts w:eastAsia="Arial"/>
-                <w:b w:val="false"/>
-                <w:color w:val="000000"/>
-                <w:sz w:val="17"/>
-              </w:rPr>
-              <w:t>.</w:t>
+              <w:t>Vérifier fonctionnement avec DMA et selection de source.</w:t>
             </w:r>
           </w:p>
         </w:tc>
@@ -1974,111 +1894,13 @@
           <w:color w:val="000000"/>
           <w:sz w:val="20"/>
         </w:rPr>
-        <w:t>La validation P1 pourra être clôturée après réussite et archivage des preuves pour le DMA matériel, et la sélection initiale. La bascule à chaud demeure une exigence complémentaire de priorité P2.</w:t>
-      </w:r>
-    </w:p>
-    <w:p>
-      <w:pPr>
-        <w:pStyle w:val="Heading1"/>
-        <w:rPr/>
-      </w:pPr>
-      <w:r>
-        <w:rPr/>
-        <w:t>5. Éléments de preuve consultés</w:t>
-      </w:r>
-    </w:p>
-    <w:p>
-      <w:pPr>
-        <w:pStyle w:val="ListBullet"/>
-        <w:numPr>
-          <w:ilvl w:val="0"/>
-          <w:numId w:val="1"/>
-        </w:numPr>
-        <w:spacing w:before="0" w:after="40"/>
-        <w:ind w:hanging="173" w:start="360"/>
-        <w:contextualSpacing/>
-        <w:rPr/>
-      </w:pPr>
-      <w:r>
-        <w:rPr>
-          <w:rFonts w:eastAsia="Arial"/>
-          <w:b w:val="false"/>
-          <w:color w:val="000000"/>
-          <w:sz w:val="19"/>
-        </w:rPr>
-        <w:t>SRS : 20260709-SRS-SoC-Tracking__720__0.pdf, révision AB.</w:t>
-      </w:r>
-    </w:p>
-    <w:p>
-      <w:pPr>
-        <w:pStyle w:val="ListBullet"/>
-        <w:numPr>
-          <w:ilvl w:val="0"/>
-          <w:numId w:val="1"/>
-        </w:numPr>
-        <w:spacing w:before="0" w:after="40"/>
-        <w:ind w:hanging="173" w:start="360"/>
-        <w:contextualSpacing/>
-        <w:rPr/>
-      </w:pPr>
-      <w:r>
-        <w:rPr>
-          <w:rFonts w:eastAsia="Arial"/>
-          <w:b w:val="false"/>
-          <w:color w:val="000000"/>
-          <w:sz w:val="19"/>
-        </w:rPr>
-        <w:t>DMA : DMA24bUnit_mm2s_csim.log, DMA24b_mm2s.cpp, tb.cpp et generics_n_options.h.</w:t>
-      </w:r>
-    </w:p>
-    <w:p>
-      <w:pPr>
-        <w:pStyle w:val="ListBullet"/>
-        <w:numPr>
-          <w:ilvl w:val="0"/>
-          <w:numId w:val="1"/>
-        </w:numPr>
-        <w:spacing w:before="0" w:after="40"/>
-        <w:ind w:hanging="173" w:start="360"/>
-        <w:contextualSpacing/>
-        <w:rPr/>
-      </w:pPr>
-      <w:r>
-        <w:rPr>
-          <w:rFonts w:eastAsia="Arial"/>
-          <w:b w:val="false"/>
-          <w:color w:val="000000"/>
-          <w:sz w:val="19"/>
-        </w:rPr>
-        <w:t>VGA : top.vhd, Cora-Z7-10-Master.xdc, journaux Vivado synth_1 et impl_1, top_timing_summary_routed.rpt et top.bit.</w:t>
-      </w:r>
-    </w:p>
-    <w:p>
-      <w:pPr>
-        <w:pStyle w:val="ListBullet"/>
-        <w:numPr>
-          <w:ilvl w:val="0"/>
-          <w:numId w:val="1"/>
-        </w:numPr>
-        <w:spacing w:before="0" w:after="40"/>
-        <w:ind w:hanging="173" w:start="360"/>
-        <w:contextualSpacing/>
-        <w:rPr/>
-      </w:pPr>
-      <w:r>
-        <w:rPr>
-          <w:rFonts w:eastAsia="Arial"/>
-          <w:b w:val="false"/>
-          <w:color w:val="000000"/>
-          <w:sz w:val="19"/>
-        </w:rPr>
-        <w:t>Infrastructure de test AXI4-Stream : Axi4s_driver.vhd et Axi4s_monitor.vhd; aucun journal de résultat TPG correspondant n’est présent.</w:t>
+        <w:t>La validation P1 pourra être clôturée après réussite et archivage des preuves pour le DMA matériel, et la sélection initiale.</w:t>
       </w:r>
     </w:p>
     <w:sectPr>
-      <w:footerReference w:type="even" r:id="rId2"/>
-      <w:footerReference w:type="default" r:id="rId3"/>
-      <w:footerReference w:type="first" r:id="rId4"/>
+      <w:footerReference w:type="even" r:id="rId4"/>
+      <w:footerReference w:type="default" r:id="rId5"/>
+      <w:footerReference w:type="first" r:id="rId6"/>
       <w:type w:val="nextPage"/>
       <w:pgSz w:w="11906" w:h="16838"/>
       <w:pgMar w:left="1094" w:right="1094" w:gutter="0" w:header="0" w:top="1037" w:footer="490" w:bottom="979"/>
@@ -2228,6 +2050,7 @@
         </w:tabs>
         <w:ind w:start="1080" w:hanging="360"/>
       </w:pPr>
+      <w:rPr/>
     </w:lvl>
     <w:lvl w:ilvl="2">
       <w:start w:val="1"/>
@@ -2240,6 +2063,7 @@
         </w:tabs>
         <w:ind w:start="1440" w:hanging="360"/>
       </w:pPr>
+      <w:rPr/>
     </w:lvl>
     <w:lvl w:ilvl="3">
       <w:start w:val="1"/>
@@ -2252,6 +2076,7 @@
         </w:tabs>
         <w:ind w:start="1800" w:hanging="360"/>
       </w:pPr>
+      <w:rPr/>
     </w:lvl>
     <w:lvl w:ilvl="4">
       <w:start w:val="1"/>
@@ -2264,6 +2089,7 @@
         </w:tabs>
         <w:ind w:start="2160" w:hanging="360"/>
       </w:pPr>
+      <w:rPr/>
     </w:lvl>
     <w:lvl w:ilvl="5">
       <w:start w:val="1"/>
@@ -2276,6 +2102,7 @@
         </w:tabs>
         <w:ind w:start="2520" w:hanging="360"/>
       </w:pPr>
+      <w:rPr/>
     </w:lvl>
     <w:lvl w:ilvl="6">
       <w:start w:val="1"/>
@@ -2288,6 +2115,7 @@
         </w:tabs>
         <w:ind w:start="2880" w:hanging="360"/>
       </w:pPr>
+      <w:rPr/>
     </w:lvl>
     <w:lvl w:ilvl="7">
       <w:start w:val="1"/>
@@ -2300,6 +2128,7 @@
         </w:tabs>
         <w:ind w:start="3240" w:hanging="360"/>
       </w:pPr>
+      <w:rPr/>
     </w:lvl>
     <w:lvl w:ilvl="8">
       <w:start w:val="1"/>
@@ -2312,6 +2141,7 @@
         </w:tabs>
         <w:ind w:start="3600" w:hanging="360"/>
       </w:pPr>
+      <w:rPr/>
     </w:lvl>
   </w:abstractNum>
   <w:abstractNum w:abstractNumId="2">
@@ -2341,6 +2171,7 @@
         </w:tabs>
         <w:ind w:start="1080" w:hanging="360"/>
       </w:pPr>
+      <w:rPr/>
     </w:lvl>
     <w:lvl w:ilvl="2">
       <w:start w:val="1"/>
@@ -2353,6 +2184,7 @@
         </w:tabs>
         <w:ind w:start="1440" w:hanging="360"/>
       </w:pPr>
+      <w:rPr/>
     </w:lvl>
     <w:lvl w:ilvl="3">
       <w:start w:val="1"/>
@@ -2365,6 +2197,7 @@
         </w:tabs>
         <w:ind w:start="1800" w:hanging="360"/>
       </w:pPr>
+      <w:rPr/>
     </w:lvl>
     <w:lvl w:ilvl="4">
       <w:start w:val="1"/>
@@ -2377,6 +2210,7 @@
         </w:tabs>
         <w:ind w:start="2160" w:hanging="360"/>
       </w:pPr>
+      <w:rPr/>
     </w:lvl>
     <w:lvl w:ilvl="5">
       <w:start w:val="1"/>
@@ -2389,6 +2223,7 @@
         </w:tabs>
         <w:ind w:start="2520" w:hanging="360"/>
       </w:pPr>
+      <w:rPr/>
     </w:lvl>
     <w:lvl w:ilvl="6">
       <w:start w:val="1"/>
@@ -2401,6 +2236,7 @@
         </w:tabs>
         <w:ind w:start="2880" w:hanging="360"/>
       </w:pPr>
+      <w:rPr/>
     </w:lvl>
     <w:lvl w:ilvl="7">
       <w:start w:val="1"/>
@@ -2413,6 +2249,7 @@
         </w:tabs>
         <w:ind w:start="3240" w:hanging="360"/>
       </w:pPr>
+      <w:rPr/>
     </w:lvl>
     <w:lvl w:ilvl="8">
       <w:start w:val="1"/>
@@ -2425,6 +2262,7 @@
         </w:tabs>
         <w:ind w:start="3600" w:hanging="360"/>
       </w:pPr>
+      <w:rPr/>
     </w:lvl>
   </w:abstractNum>
   <w:abstractNum w:abstractNumId="3">
@@ -2454,6 +2292,7 @@
         </w:tabs>
         <w:ind w:start="1080" w:hanging="360"/>
       </w:pPr>
+      <w:rPr/>
     </w:lvl>
     <w:lvl w:ilvl="2">
       <w:start w:val="1"/>
@@ -2466,6 +2305,7 @@
         </w:tabs>
         <w:ind w:start="1440" w:hanging="360"/>
       </w:pPr>
+      <w:rPr/>
     </w:lvl>
     <w:lvl w:ilvl="3">
       <w:start w:val="1"/>
@@ -2478,6 +2318,7 @@
         </w:tabs>
         <w:ind w:start="1800" w:hanging="360"/>
       </w:pPr>
+      <w:rPr/>
     </w:lvl>
     <w:lvl w:ilvl="4">
       <w:start w:val="1"/>
@@ -2490,6 +2331,7 @@
         </w:tabs>
         <w:ind w:start="2160" w:hanging="360"/>
       </w:pPr>
+      <w:rPr/>
     </w:lvl>
     <w:lvl w:ilvl="5">
       <w:start w:val="1"/>
@@ -2502,6 +2344,7 @@
         </w:tabs>
         <w:ind w:start="2520" w:hanging="360"/>
       </w:pPr>
+      <w:rPr/>
     </w:lvl>
     <w:lvl w:ilvl="6">
       <w:start w:val="1"/>
@@ -2514,6 +2357,7 @@
         </w:tabs>
         <w:ind w:start="2880" w:hanging="360"/>
       </w:pPr>
+      <w:rPr/>
     </w:lvl>
     <w:lvl w:ilvl="7">
       <w:start w:val="1"/>
@@ -2526,6 +2370,7 @@
         </w:tabs>
         <w:ind w:start="3240" w:hanging="360"/>
       </w:pPr>
+      <w:rPr/>
     </w:lvl>
     <w:lvl w:ilvl="8">
       <w:start w:val="1"/>
@@ -2538,6 +2383,7 @@
         </w:tabs>
         <w:ind w:start="3600" w:hanging="360"/>
       </w:pPr>
+      <w:rPr/>
     </w:lvl>
   </w:abstractNum>
   <w:abstractNum w:abstractNumId="4">
@@ -2565,6 +2411,7 @@
         </w:tabs>
         <w:ind w:start="1080" w:hanging="360"/>
       </w:pPr>
+      <w:rPr/>
     </w:lvl>
     <w:lvl w:ilvl="2">
       <w:start w:val="1"/>
@@ -2577,6 +2424,7 @@
         </w:tabs>
         <w:ind w:start="1440" w:hanging="360"/>
       </w:pPr>
+      <w:rPr/>
     </w:lvl>
     <w:lvl w:ilvl="3">
       <w:start w:val="1"/>
@@ -2589,6 +2437,7 @@
         </w:tabs>
         <w:ind w:start="1800" w:hanging="360"/>
       </w:pPr>
+      <w:rPr/>
     </w:lvl>
     <w:lvl w:ilvl="4">
       <w:start w:val="1"/>
@@ -2601,6 +2450,7 @@
         </w:tabs>
         <w:ind w:start="2160" w:hanging="360"/>
       </w:pPr>
+      <w:rPr/>
     </w:lvl>
     <w:lvl w:ilvl="5">
       <w:start w:val="1"/>
@@ -2613,6 +2463,7 @@
         </w:tabs>
         <w:ind w:start="2520" w:hanging="360"/>
       </w:pPr>
+      <w:rPr/>
     </w:lvl>
     <w:lvl w:ilvl="6">
       <w:start w:val="1"/>
@@ -2625,6 +2476,7 @@
         </w:tabs>
         <w:ind w:start="2880" w:hanging="360"/>
       </w:pPr>
+      <w:rPr/>
     </w:lvl>
     <w:lvl w:ilvl="7">
       <w:start w:val="1"/>
@@ -2637,6 +2489,7 @@
         </w:tabs>
         <w:ind w:start="3240" w:hanging="360"/>
       </w:pPr>
+      <w:rPr/>
     </w:lvl>
     <w:lvl w:ilvl="8">
       <w:start w:val="1"/>
@@ -2649,6 +2502,7 @@
         </w:tabs>
         <w:ind w:start="3600" w:hanging="360"/>
       </w:pPr>
+      <w:rPr/>
     </w:lvl>
   </w:abstractNum>
   <w:abstractNum w:abstractNumId="5">
@@ -2676,6 +2530,7 @@
         </w:tabs>
         <w:ind w:start="1080" w:hanging="360"/>
       </w:pPr>
+      <w:rPr/>
     </w:lvl>
     <w:lvl w:ilvl="2">
       <w:start w:val="1"/>
@@ -2688,6 +2543,7 @@
         </w:tabs>
         <w:ind w:start="1440" w:hanging="360"/>
       </w:pPr>
+      <w:rPr/>
     </w:lvl>
     <w:lvl w:ilvl="3">
       <w:start w:val="1"/>
@@ -2700,6 +2556,7 @@
         </w:tabs>
         <w:ind w:start="1800" w:hanging="360"/>
       </w:pPr>
+      <w:rPr/>
     </w:lvl>
     <w:lvl w:ilvl="4">
       <w:start w:val="1"/>
@@ -2712,6 +2569,7 @@
         </w:tabs>
         <w:ind w:start="2160" w:hanging="360"/>
       </w:pPr>
+      <w:rPr/>
     </w:lvl>
     <w:lvl w:ilvl="5">
       <w:start w:val="1"/>
@@ -2724,6 +2582,7 @@
         </w:tabs>
         <w:ind w:start="2520" w:hanging="360"/>
       </w:pPr>
+      <w:rPr/>
     </w:lvl>
     <w:lvl w:ilvl="6">
       <w:start w:val="1"/>
@@ -2736,6 +2595,7 @@
         </w:tabs>
         <w:ind w:start="2880" w:hanging="360"/>
       </w:pPr>
+      <w:rPr/>
     </w:lvl>
     <w:lvl w:ilvl="7">
       <w:start w:val="1"/>
@@ -2748,6 +2608,7 @@
         </w:tabs>
         <w:ind w:start="3240" w:hanging="360"/>
       </w:pPr>
+      <w:rPr/>
     </w:lvl>
     <w:lvl w:ilvl="8">
       <w:start w:val="1"/>
@@ -2760,6 +2621,7 @@
         </w:tabs>
         <w:ind w:start="3600" w:hanging="360"/>
       </w:pPr>
+      <w:rPr/>
     </w:lvl>
   </w:abstractNum>
   <w:abstractNum w:abstractNumId="6">
@@ -2787,6 +2649,7 @@
         </w:tabs>
         <w:ind w:start="1080" w:hanging="360"/>
       </w:pPr>
+      <w:rPr/>
     </w:lvl>
     <w:lvl w:ilvl="2">
       <w:start w:val="1"/>
@@ -2799,6 +2662,7 @@
         </w:tabs>
         <w:ind w:start="1440" w:hanging="360"/>
       </w:pPr>
+      <w:rPr/>
     </w:lvl>
     <w:lvl w:ilvl="3">
       <w:start w:val="1"/>
@@ -2811,6 +2675,7 @@
         </w:tabs>
         <w:ind w:start="1800" w:hanging="360"/>
       </w:pPr>
+      <w:rPr/>
     </w:lvl>
     <w:lvl w:ilvl="4">
       <w:start w:val="1"/>
@@ -2823,6 +2688,7 @@
         </w:tabs>
         <w:ind w:start="2160" w:hanging="360"/>
       </w:pPr>
+      <w:rPr/>
     </w:lvl>
     <w:lvl w:ilvl="5">
       <w:start w:val="1"/>
@@ -2835,6 +2701,7 @@
         </w:tabs>
         <w:ind w:start="2520" w:hanging="360"/>
       </w:pPr>
+      <w:rPr/>
     </w:lvl>
     <w:lvl w:ilvl="6">
       <w:start w:val="1"/>
@@ -2847,6 +2714,7 @@
         </w:tabs>
         <w:ind w:start="2880" w:hanging="360"/>
       </w:pPr>
+      <w:rPr/>
     </w:lvl>
     <w:lvl w:ilvl="7">
       <w:start w:val="1"/>
@@ -2859,6 +2727,7 @@
         </w:tabs>
         <w:ind w:start="3240" w:hanging="360"/>
       </w:pPr>
+      <w:rPr/>
     </w:lvl>
     <w:lvl w:ilvl="8">
       <w:start w:val="1"/>
@@ -2871,6 +2740,7 @@
         </w:tabs>
         <w:ind w:start="3600" w:hanging="360"/>
       </w:pPr>
+      <w:rPr/>
     </w:lvl>
   </w:abstractNum>
   <w:abstractNum w:abstractNumId="7">
@@ -3021,7 +2891,7 @@
   <w:docDefaults>
     <w:rPrDefault>
       <w:rPr>
-        <w:rFonts w:ascii="Cambria" w:hAnsi="Cambria" w:eastAsia="ＭＳ 明朝" w:cs="" w:asciiTheme="minorHAnsi" w:cstheme="minorBidi" w:eastAsiaTheme="minorEastAsia" w:hAnsiTheme="minorHAnsi"/>
+        <w:rFonts w:ascii="Cambria" w:hAnsi="Cambria" w:eastAsia="" w:cs="" w:asciiTheme="minorHAnsi" w:cstheme="minorBidi" w:eastAsiaTheme="minorEastAsia" w:hAnsiTheme="minorHAnsi"/>
         <w:sz w:val="22"/>
         <w:szCs w:val="22"/>
         <w:lang w:val="en-US" w:eastAsia="en-US" w:bidi="ar-SA"/>
@@ -3178,6 +3048,7 @@
     <w:rsid w:val="00fc693f"/>
     <w:pPr>
       <w:widowControl/>
+      <w:suppressAutoHyphens w:val="true"/>
       <w:bidi w:val="0"/>
       <w:spacing w:lineRule="auto" w:line="259" w:before="0" w:after="100"/>
       <w:jc w:val="start"/>
@@ -3206,7 +3077,7 @@
       <w:outlineLvl w:val="0"/>
     </w:pPr>
     <w:rPr>
-      <w:rFonts w:ascii="Calibri" w:hAnsi="Calibri" w:eastAsia="ＭＳ ゴシック" w:cs="" w:asciiTheme="majorHAnsi" w:cstheme="majorBidi" w:eastAsiaTheme="majorEastAsia" w:hAnsiTheme="majorHAnsi"/>
+      <w:rFonts w:ascii="Calibri" w:hAnsi="Calibri" w:eastAsia="" w:cs="" w:asciiTheme="majorHAnsi" w:cstheme="majorBidi" w:eastAsiaTheme="majorEastAsia" w:hAnsiTheme="majorHAnsi"/>
       <w:b/>
       <w:bCs/>
       <w:color w:val="000000"/>
@@ -3230,7 +3101,7 @@
       <w:outlineLvl w:val="1"/>
     </w:pPr>
     <w:rPr>
-      <w:rFonts w:ascii="Calibri" w:hAnsi="Calibri" w:eastAsia="ＭＳ ゴシック" w:cs="" w:asciiTheme="majorHAnsi" w:cstheme="majorBidi" w:eastAsiaTheme="majorEastAsia" w:hAnsiTheme="majorHAnsi"/>
+      <w:rFonts w:ascii="Calibri" w:hAnsi="Calibri" w:eastAsia="" w:cs="" w:asciiTheme="majorHAnsi" w:cstheme="majorBidi" w:eastAsiaTheme="majorEastAsia" w:hAnsiTheme="majorHAnsi"/>
       <w:b/>
       <w:bCs/>
       <w:color w:val="000000"/>
@@ -3254,7 +3125,7 @@
       <w:outlineLvl w:val="2"/>
     </w:pPr>
     <w:rPr>
-      <w:rFonts w:ascii="Calibri" w:hAnsi="Calibri" w:eastAsia="ＭＳ ゴシック" w:cs="" w:asciiTheme="majorHAnsi" w:cstheme="majorBidi" w:eastAsiaTheme="majorEastAsia" w:hAnsiTheme="majorHAnsi"/>
+      <w:rFonts w:ascii="Calibri" w:hAnsi="Calibri" w:eastAsia="" w:cs="" w:asciiTheme="majorHAnsi" w:cstheme="majorBidi" w:eastAsiaTheme="majorEastAsia" w:hAnsiTheme="majorHAnsi"/>
       <w:b/>
       <w:bCs/>
       <w:color w:val="000000"/>
@@ -3278,7 +3149,7 @@
       <w:outlineLvl w:val="3"/>
     </w:pPr>
     <w:rPr>
-      <w:rFonts w:ascii="Calibri" w:hAnsi="Calibri" w:eastAsia="ＭＳ ゴシック" w:cs="" w:asciiTheme="majorHAnsi" w:cstheme="majorBidi" w:eastAsiaTheme="majorEastAsia" w:hAnsiTheme="majorHAnsi"/>
+      <w:rFonts w:ascii="Calibri" w:hAnsi="Calibri" w:eastAsia="" w:cs="" w:asciiTheme="majorHAnsi" w:cstheme="majorBidi" w:eastAsiaTheme="majorEastAsia" w:hAnsiTheme="majorHAnsi"/>
       <w:b/>
       <w:bCs/>
       <w:i/>
@@ -3303,7 +3174,7 @@
       <w:outlineLvl w:val="4"/>
     </w:pPr>
     <w:rPr>
-      <w:rFonts w:ascii="Calibri" w:hAnsi="Calibri" w:eastAsia="ＭＳ ゴシック" w:cs="" w:asciiTheme="majorHAnsi" w:cstheme="majorBidi" w:eastAsiaTheme="majorEastAsia" w:hAnsiTheme="majorHAnsi"/>
+      <w:rFonts w:ascii="Calibri" w:hAnsi="Calibri" w:eastAsia="" w:cs="" w:asciiTheme="majorHAnsi" w:cstheme="majorBidi" w:eastAsiaTheme="majorEastAsia" w:hAnsiTheme="majorHAnsi"/>
       <w:color w:themeColor="accent1" w:themeShade="7f" w:val="243F60"/>
     </w:rPr>
   </w:style>
@@ -3324,7 +3195,7 @@
       <w:outlineLvl w:val="5"/>
     </w:pPr>
     <w:rPr>
-      <w:rFonts w:ascii="Calibri" w:hAnsi="Calibri" w:eastAsia="ＭＳ ゴシック" w:cs="" w:asciiTheme="majorHAnsi" w:cstheme="majorBidi" w:eastAsiaTheme="majorEastAsia" w:hAnsiTheme="majorHAnsi"/>
+      <w:rFonts w:ascii="Calibri" w:hAnsi="Calibri" w:eastAsia="" w:cs="" w:asciiTheme="majorHAnsi" w:cstheme="majorBidi" w:eastAsiaTheme="majorEastAsia" w:hAnsiTheme="majorHAnsi"/>
       <w:i/>
       <w:iCs/>
       <w:color w:themeColor="accent1" w:themeShade="7f" w:val="243F60"/>
@@ -3347,7 +3218,7 @@
       <w:outlineLvl w:val="6"/>
     </w:pPr>
     <w:rPr>
-      <w:rFonts w:ascii="Calibri" w:hAnsi="Calibri" w:eastAsia="ＭＳ ゴシック" w:cs="" w:asciiTheme="majorHAnsi" w:cstheme="majorBidi" w:eastAsiaTheme="majorEastAsia" w:hAnsiTheme="majorHAnsi"/>
+      <w:rFonts w:ascii="Calibri" w:hAnsi="Calibri" w:eastAsia="" w:cs="" w:asciiTheme="majorHAnsi" w:cstheme="majorBidi" w:eastAsiaTheme="majorEastAsia" w:hAnsiTheme="majorHAnsi"/>
       <w:i/>
       <w:iCs/>
       <w:color w:themeColor="text1" w:themeTint="bf" w:val="404040"/>
@@ -3370,7 +3241,7 @@
       <w:outlineLvl w:val="7"/>
     </w:pPr>
     <w:rPr>
-      <w:rFonts w:ascii="Calibri" w:hAnsi="Calibri" w:eastAsia="ＭＳ ゴシック" w:cs="" w:asciiTheme="majorHAnsi" w:cstheme="majorBidi" w:eastAsiaTheme="majorEastAsia" w:hAnsiTheme="majorHAnsi"/>
+      <w:rFonts w:ascii="Calibri" w:hAnsi="Calibri" w:eastAsia="" w:cs="" w:asciiTheme="majorHAnsi" w:cstheme="majorBidi" w:eastAsiaTheme="majorEastAsia" w:hAnsiTheme="majorHAnsi"/>
       <w:color w:themeColor="accent1" w:val="4F81BD"/>
       <w:sz w:val="20"/>
       <w:szCs w:val="20"/>
@@ -3393,7 +3264,7 @@
       <w:outlineLvl w:val="8"/>
     </w:pPr>
     <w:rPr>
-      <w:rFonts w:ascii="Calibri" w:hAnsi="Calibri" w:eastAsia="ＭＳ ゴシック" w:cs="" w:asciiTheme="majorHAnsi" w:cstheme="majorBidi" w:eastAsiaTheme="majorEastAsia" w:hAnsiTheme="majorHAnsi"/>
+      <w:rFonts w:ascii="Calibri" w:hAnsi="Calibri" w:eastAsia="" w:cs="" w:asciiTheme="majorHAnsi" w:cstheme="majorBidi" w:eastAsiaTheme="majorEastAsia" w:hAnsiTheme="majorHAnsi"/>
       <w:i/>
       <w:iCs/>
       <w:color w:themeColor="text1" w:themeTint="bf" w:val="404040"/>
@@ -3432,7 +3303,7 @@
     <w:qFormat/>
     <w:rsid w:val="00fc693f"/>
     <w:rPr>
-      <w:rFonts w:ascii="Calibri" w:hAnsi="Calibri" w:eastAsia="ＭＳ ゴシック" w:cs="" w:asciiTheme="majorHAnsi" w:cstheme="majorBidi" w:eastAsiaTheme="majorEastAsia" w:hAnsiTheme="majorHAnsi"/>
+      <w:rFonts w:ascii="Calibri" w:hAnsi="Calibri" w:eastAsia="" w:cs="" w:asciiTheme="majorHAnsi" w:cstheme="majorBidi" w:eastAsiaTheme="majorEastAsia" w:hAnsiTheme="majorHAnsi"/>
       <w:b/>
       <w:bCs/>
       <w:color w:themeColor="accent1" w:themeShade="bf" w:val="365F91"/>
@@ -3447,7 +3318,7 @@
     <w:qFormat/>
     <w:rsid w:val="00fc693f"/>
     <w:rPr>
-      <w:rFonts w:ascii="Calibri" w:hAnsi="Calibri" w:eastAsia="ＭＳ ゴシック" w:cs="" w:asciiTheme="majorHAnsi" w:cstheme="majorBidi" w:eastAsiaTheme="majorEastAsia" w:hAnsiTheme="majorHAnsi"/>
+      <w:rFonts w:ascii="Calibri" w:hAnsi="Calibri" w:eastAsia="" w:cs="" w:asciiTheme="majorHAnsi" w:cstheme="majorBidi" w:eastAsiaTheme="majorEastAsia" w:hAnsiTheme="majorHAnsi"/>
       <w:b/>
       <w:bCs/>
       <w:color w:themeColor="accent1" w:val="4F81BD"/>
@@ -3462,7 +3333,7 @@
     <w:qFormat/>
     <w:rsid w:val="00fc693f"/>
     <w:rPr>
-      <w:rFonts w:ascii="Calibri" w:hAnsi="Calibri" w:eastAsia="ＭＳ ゴシック" w:cs="" w:asciiTheme="majorHAnsi" w:cstheme="majorBidi" w:eastAsiaTheme="majorEastAsia" w:hAnsiTheme="majorHAnsi"/>
+      <w:rFonts w:ascii="Calibri" w:hAnsi="Calibri" w:eastAsia="" w:cs="" w:asciiTheme="majorHAnsi" w:cstheme="majorBidi" w:eastAsiaTheme="majorEastAsia" w:hAnsiTheme="majorHAnsi"/>
       <w:b/>
       <w:bCs/>
       <w:color w:themeColor="accent1" w:val="4F81BD"/>
@@ -3475,7 +3346,7 @@
     <w:qFormat/>
     <w:rsid w:val="00fc693f"/>
     <w:rPr>
-      <w:rFonts w:ascii="Calibri" w:hAnsi="Calibri" w:eastAsia="ＭＳ ゴシック" w:cs="" w:asciiTheme="majorHAnsi" w:cstheme="majorBidi" w:eastAsiaTheme="majorEastAsia" w:hAnsiTheme="majorHAnsi"/>
+      <w:rFonts w:ascii="Calibri" w:hAnsi="Calibri" w:eastAsia="" w:cs="" w:asciiTheme="majorHAnsi" w:cstheme="majorBidi" w:eastAsiaTheme="majorEastAsia" w:hAnsiTheme="majorHAnsi"/>
       <w:color w:themeColor="text2" w:themeShade="bf" w:val="17365D"/>
       <w:spacing w:val="5"/>
       <w:kern w:val="2"/>
@@ -3490,7 +3361,7 @@
     <w:qFormat/>
     <w:rsid w:val="00fc693f"/>
     <w:rPr>
-      <w:rFonts w:ascii="Calibri" w:hAnsi="Calibri" w:eastAsia="ＭＳ ゴシック" w:cs="" w:asciiTheme="majorHAnsi" w:cstheme="majorBidi" w:eastAsiaTheme="majorEastAsia" w:hAnsiTheme="majorHAnsi"/>
+      <w:rFonts w:ascii="Calibri" w:hAnsi="Calibri" w:eastAsia="" w:cs="" w:asciiTheme="majorHAnsi" w:cstheme="majorBidi" w:eastAsiaTheme="majorEastAsia" w:hAnsiTheme="majorHAnsi"/>
       <w:i/>
       <w:iCs/>
       <w:color w:themeColor="accent1" w:val="4F81BD"/>
@@ -3562,7 +3433,7 @@
     <w:qFormat/>
     <w:rsid w:val="00fc693f"/>
     <w:rPr>
-      <w:rFonts w:ascii="Calibri" w:hAnsi="Calibri" w:eastAsia="ＭＳ ゴシック" w:cs="" w:asciiTheme="majorHAnsi" w:cstheme="majorBidi" w:eastAsiaTheme="majorEastAsia" w:hAnsiTheme="majorHAnsi"/>
+      <w:rFonts w:ascii="Calibri" w:hAnsi="Calibri" w:eastAsia="" w:cs="" w:asciiTheme="majorHAnsi" w:cstheme="majorBidi" w:eastAsiaTheme="majorEastAsia" w:hAnsiTheme="majorHAnsi"/>
       <w:b/>
       <w:bCs/>
       <w:i/>
@@ -3578,7 +3449,7 @@
     <w:qFormat/>
     <w:rsid w:val="00fc693f"/>
     <w:rPr>
-      <w:rFonts w:ascii="Calibri" w:hAnsi="Calibri" w:eastAsia="ＭＳ ゴシック" w:cs="" w:asciiTheme="majorHAnsi" w:cstheme="majorBidi" w:eastAsiaTheme="majorEastAsia" w:hAnsiTheme="majorHAnsi"/>
+      <w:rFonts w:ascii="Calibri" w:hAnsi="Calibri" w:eastAsia="" w:cs="" w:asciiTheme="majorHAnsi" w:cstheme="majorBidi" w:eastAsiaTheme="majorEastAsia" w:hAnsiTheme="majorHAnsi"/>
       <w:color w:themeColor="accent1" w:themeShade="7f" w:val="243F60"/>
     </w:rPr>
   </w:style>
@@ -3590,7 +3461,7 @@
     <w:qFormat/>
     <w:rsid w:val="00fc693f"/>
     <w:rPr>
-      <w:rFonts w:ascii="Calibri" w:hAnsi="Calibri" w:eastAsia="ＭＳ ゴシック" w:cs="" w:asciiTheme="majorHAnsi" w:cstheme="majorBidi" w:eastAsiaTheme="majorEastAsia" w:hAnsiTheme="majorHAnsi"/>
+      <w:rFonts w:ascii="Calibri" w:hAnsi="Calibri" w:eastAsia="" w:cs="" w:asciiTheme="majorHAnsi" w:cstheme="majorBidi" w:eastAsiaTheme="majorEastAsia" w:hAnsiTheme="majorHAnsi"/>
       <w:i/>
       <w:iCs/>
       <w:color w:themeColor="accent1" w:themeShade="7f" w:val="243F60"/>
@@ -3604,7 +3475,7 @@
     <w:qFormat/>
     <w:rsid w:val="00fc693f"/>
     <w:rPr>
-      <w:rFonts w:ascii="Calibri" w:hAnsi="Calibri" w:eastAsia="ＭＳ ゴシック" w:cs="" w:asciiTheme="majorHAnsi" w:cstheme="majorBidi" w:eastAsiaTheme="majorEastAsia" w:hAnsiTheme="majorHAnsi"/>
+      <w:rFonts w:ascii="Calibri" w:hAnsi="Calibri" w:eastAsia="" w:cs="" w:asciiTheme="majorHAnsi" w:cstheme="majorBidi" w:eastAsiaTheme="majorEastAsia" w:hAnsiTheme="majorHAnsi"/>
       <w:i/>
       <w:iCs/>
       <w:color w:themeColor="text1" w:themeTint="bf" w:val="404040"/>
@@ -3618,7 +3489,7 @@
     <w:qFormat/>
     <w:rsid w:val="00fc693f"/>
     <w:rPr>
-      <w:rFonts w:ascii="Calibri" w:hAnsi="Calibri" w:eastAsia="ＭＳ ゴシック" w:cs="" w:asciiTheme="majorHAnsi" w:cstheme="majorBidi" w:eastAsiaTheme="majorEastAsia" w:hAnsiTheme="majorHAnsi"/>
+      <w:rFonts w:ascii="Calibri" w:hAnsi="Calibri" w:eastAsia="" w:cs="" w:asciiTheme="majorHAnsi" w:cstheme="majorBidi" w:eastAsiaTheme="majorEastAsia" w:hAnsiTheme="majorHAnsi"/>
       <w:color w:themeColor="accent1" w:val="4F81BD"/>
       <w:sz w:val="20"/>
       <w:szCs w:val="20"/>
@@ -3632,7 +3503,7 @@
     <w:qFormat/>
     <w:rsid w:val="00fc693f"/>
     <w:rPr>
-      <w:rFonts w:ascii="Calibri" w:hAnsi="Calibri" w:eastAsia="ＭＳ ゴシック" w:cs="" w:asciiTheme="majorHAnsi" w:cstheme="majorBidi" w:eastAsiaTheme="majorEastAsia" w:hAnsiTheme="majorHAnsi"/>
+      <w:rFonts w:ascii="Calibri" w:hAnsi="Calibri" w:eastAsia="" w:cs="" w:asciiTheme="majorHAnsi" w:cstheme="majorBidi" w:eastAsiaTheme="majorEastAsia" w:hAnsiTheme="majorHAnsi"/>
       <w:i/>
       <w:iCs/>
       <w:color w:themeColor="text1" w:themeTint="bf" w:val="404040"/>
@@ -3814,6 +3685,28 @@
       <w:rFonts w:cs="Arial"/>
     </w:rPr>
   </w:style>
+  <w:style w:type="paragraph" w:styleId="Titreuser">
+    <w:name w:val="Titre (user)"/>
+    <w:basedOn w:val="Normal"/>
+    <w:next w:val="BodyText"/>
+    <w:qFormat/>
+    <w:pPr>
+      <w:keepNext w:val="true"/>
+      <w:spacing w:before="240" w:after="120"/>
+    </w:pPr>
+    <w:rPr>
+      <w:rFonts w:ascii="Liberation Sans" w:hAnsi="Liberation Sans" w:eastAsia="Microsoft YaHei" w:cs="Arial"/>
+      <w:sz w:val="28"/>
+      <w:szCs w:val="28"/>
+    </w:rPr>
+  </w:style>
+  <w:style w:type="paragraph" w:styleId="En-tteetpieddepageuser">
+    <w:name w:val="En-tête et pied de page (user)"/>
+    <w:basedOn w:val="Normal"/>
+    <w:qFormat/>
+    <w:pPr/>
+    <w:rPr/>
+  </w:style>
   <w:style w:type="paragraph" w:styleId="En-tteetpieddepage">
     <w:name w:val="En-tête et pied de page"/>
     <w:basedOn w:val="Normal"/>
@@ -3862,12 +3755,13 @@
     <w:rsid w:val="00fc693f"/>
     <w:pPr>
       <w:widowControl/>
+      <w:suppressAutoHyphens w:val="true"/>
       <w:bidi w:val="0"/>
       <w:spacing w:lineRule="auto" w:line="240" w:before="0" w:after="0"/>
       <w:jc w:val="start"/>
     </w:pPr>
     <w:rPr>
-      <w:rFonts w:ascii="Cambria" w:hAnsi="Cambria" w:eastAsia="ＭＳ 明朝" w:cs="" w:asciiTheme="minorHAnsi" w:cstheme="minorBidi" w:eastAsiaTheme="minorEastAsia" w:hAnsiTheme="minorHAnsi"/>
+      <w:rFonts w:ascii="Cambria" w:hAnsi="Cambria" w:eastAsia="" w:cs="" w:asciiTheme="minorHAnsi" w:cstheme="minorBidi" w:eastAsiaTheme="minorEastAsia" w:hAnsiTheme="minorHAnsi"/>
       <w:color w:val="auto"/>
       <w:kern w:val="0"/>
       <w:sz w:val="22"/>
@@ -3889,7 +3783,7 @@
       <w:contextualSpacing/>
     </w:pPr>
     <w:rPr>
-      <w:rFonts w:ascii="Calibri" w:hAnsi="Calibri" w:eastAsia="ＭＳ ゴシック" w:cs="" w:asciiTheme="majorHAnsi" w:cstheme="majorBidi" w:eastAsiaTheme="majorEastAsia" w:hAnsiTheme="majorHAnsi"/>
+      <w:rFonts w:ascii="Calibri" w:hAnsi="Calibri" w:eastAsia="" w:cs="" w:asciiTheme="majorHAnsi" w:cstheme="majorBidi" w:eastAsiaTheme="majorEastAsia" w:hAnsiTheme="majorHAnsi"/>
       <w:b/>
       <w:color w:val="000000"/>
       <w:spacing w:val="5"/>
@@ -3909,7 +3803,7 @@
     <w:rsid w:val="00fc693f"/>
     <w:pPr/>
     <w:rPr>
-      <w:rFonts w:ascii="Calibri" w:hAnsi="Calibri" w:eastAsia="ＭＳ ゴシック" w:cs="" w:asciiTheme="majorHAnsi" w:cstheme="majorBidi" w:eastAsiaTheme="majorEastAsia" w:hAnsiTheme="majorHAnsi"/>
+      <w:rFonts w:ascii="Calibri" w:hAnsi="Calibri" w:eastAsia="" w:cs="" w:asciiTheme="majorHAnsi" w:cstheme="majorBidi" w:eastAsiaTheme="majorEastAsia" w:hAnsiTheme="majorHAnsi"/>
       <w:i/>
       <w:iCs/>
       <w:color w:themeColor="accent1" w:val="4F81BD"/>
@@ -4142,12 +4036,13 @@
         <w:tab w:val="left" w:pos="3456" w:leader="none"/>
         <w:tab w:val="left" w:pos="4032" w:leader="none"/>
       </w:tabs>
+      <w:suppressAutoHyphens w:val="true"/>
       <w:bidi w:val="0"/>
       <w:spacing w:lineRule="auto" w:line="276" w:before="0" w:after="200"/>
       <w:jc w:val="start"/>
     </w:pPr>
     <w:rPr>
-      <w:rFonts w:ascii="Courier" w:hAnsi="Courier" w:eastAsia="ＭＳ 明朝" w:cs="" w:cstheme="minorBidi" w:eastAsiaTheme="minorEastAsia"/>
+      <w:rFonts w:ascii="Courier" w:hAnsi="Courier" w:eastAsia="" w:cs="" w:cstheme="minorBidi" w:eastAsiaTheme="minorEastAsia"/>
       <w:color w:val="auto"/>
       <w:kern w:val="0"/>
       <w:sz w:val="20"/>
@@ -4195,7 +4090,7 @@
   </w:style>
   <w:style w:type="paragraph" w:styleId="IndexHeading">
     <w:name w:val="index heading"/>
-    <w:basedOn w:val="Titre"/>
+    <w:basedOn w:val="Titreuser"/>
     <w:pPr/>
     <w:rPr/>
   </w:style>
@@ -4213,8 +4108,8 @@
     </w:pPr>
     <w:rPr/>
   </w:style>
-  <w:style w:type="numbering" w:styleId="Pasdeliste" w:default="1">
-    <w:name w:val="Pas de liste"/>
+  <w:style w:type="numbering" w:styleId="Pasdelisteuser" w:default="1">
+    <w:name w:val="Pas de liste (user)"/>
     <w:uiPriority w:val="99"/>
     <w:semiHidden/>
     <w:unhideWhenUsed/>
@@ -7345,7 +7240,6 @@
       <w:pPr>
         <w:spacing w:before="0" w:after="0" w:line="240" w:lineRule="auto"/>
       </w:pPr>
-      <w:rPr/>
       <w:tblPr/>
       <w:tcPr>
         <w:tcBorders>
@@ -7491,7 +7385,6 @@
       <w:pPr>
         <w:spacing w:before="0" w:after="0" w:line="240" w:lineRule="auto"/>
       </w:pPr>
-      <w:rPr/>
       <w:tblPr/>
       <w:tcPr>
         <w:tcBorders>
@@ -7637,7 +7530,6 @@
       <w:pPr>
         <w:spacing w:before="0" w:after="0" w:line="240" w:lineRule="auto"/>
       </w:pPr>
-      <w:rPr/>
       <w:tblPr/>
       <w:tcPr>
         <w:tcBorders>
@@ -7783,7 +7675,6 @@
       <w:pPr>
         <w:spacing w:before="0" w:after="0" w:line="240" w:lineRule="auto"/>
       </w:pPr>
-      <w:rPr/>
       <w:tblPr/>
       <w:tcPr>
         <w:tcBorders>
@@ -7929,7 +7820,6 @@
       <w:pPr>
         <w:spacing w:before="0" w:after="0" w:line="240" w:lineRule="auto"/>
       </w:pPr>
-      <w:rPr/>
       <w:tblPr/>
       <w:tcPr>
         <w:tcBorders>
@@ -8075,7 +7965,6 @@
       <w:pPr>
         <w:spacing w:before="0" w:after="0" w:line="240" w:lineRule="auto"/>
       </w:pPr>
-      <w:rPr/>
       <w:tblPr/>
       <w:tcPr>
         <w:tcBorders>
@@ -8221,7 +8110,6 @@
       <w:pPr>
         <w:spacing w:before="0" w:after="0" w:line="240" w:lineRule="auto"/>
       </w:pPr>
-      <w:rPr/>
       <w:tblPr/>
       <w:tcPr>
         <w:tcBorders>

</xml_diff>